<commit_message>
Updated the file Alternates_Delta_Vega.docx
</commit_message>
<xml_diff>
--- a/Alternates_Delta_Vega.docx
+++ b/Alternates_Delta_Vega.docx
@@ -793,14 +793,11 @@
     </w:p>
     <w:p>
       <w:r>
-        <w:rPr>
-          <w:noProof/>
-        </w:rPr>
         <w:drawing>
-          <wp:inline distT="0" distB="0" distL="0" distR="0" wp14:anchorId="7CBFE828" wp14:editId="693A4E4D">
-            <wp:extent cx="3400000" cy="466667"/>
-            <wp:effectExtent l="0" t="0" r="0" b="0"/>
-            <wp:docPr id="2063204199" name="Picture 1"/>
+          <wp:inline distT="0" distB="0" distL="0" distR="0" wp14:anchorId="77C55414" wp14:editId="68378D95">
+            <wp:extent cx="2257740" cy="638264"/>
+            <wp:effectExtent l="0" t="0" r="9525" b="9525"/>
+            <wp:docPr id="873304988" name="Picture 1"/>
             <wp:cNvGraphicFramePr>
               <a:graphicFrameLocks xmlns:a="http://schemas.openxmlformats.org/drawingml/2006/main" noChangeAspect="1"/>
             </wp:cNvGraphicFramePr>
@@ -808,7 +805,7 @@
               <a:graphicData uri="http://schemas.openxmlformats.org/drawingml/2006/picture">
                 <pic:pic xmlns:pic="http://schemas.openxmlformats.org/drawingml/2006/picture">
                   <pic:nvPicPr>
-                    <pic:cNvPr id="2063204199" name=""/>
+                    <pic:cNvPr id="873304988" name=""/>
                     <pic:cNvPicPr/>
                   </pic:nvPicPr>
                   <pic:blipFill>
@@ -820,7 +817,7 @@
                   <pic:spPr>
                     <a:xfrm>
                       <a:off x="0" y="0"/>
-                      <a:ext cx="3400000" cy="466667"/>
+                      <a:ext cx="2257740" cy="638264"/>
                     </a:xfrm>
                     <a:prstGeom prst="rect">
                       <a:avLst/>

</xml_diff>